<commit_message>
Small fixes from recomendations.
</commit_message>
<xml_diff>
--- a/GeneralNotes.docx
+++ b/GeneralNotes.docx
@@ -45,7 +45,15 @@
     <w:p/>
     <w:p>
       <w:r>
-        <w:t>I have broken the feedback up by script, each script getting a section to itself. Let me know if you have questions or don’t understand what I’m trying to say. I also get pretty nitpicky, so feel free to ignore anything that seems irrelevant.</w:t>
+        <w:t xml:space="preserve">I have broken the feedback up by script, each script getting a section to itself. Let me know if you have questions or don’t understand what I’m trying to say. I also get </w:t>
+      </w:r>
+      <w:proofErr w:type="gramStart"/>
+      <w:r>
+        <w:t>pretty nitpicky</w:t>
+      </w:r>
+      <w:proofErr w:type="gramEnd"/>
+      <w:r>
+        <w:t>, so feel free to ignore anything that seems irrelevant.</w:t>
       </w:r>
     </w:p>
     <w:p/>
@@ -208,11 +216,16 @@
       <w:r>
         <w:t xml:space="preserve">You refer to connecting the subsystem references twice. It sounds like you have two separate models, but I don’t think you do. It’s a bit confusing because I think the paragraphs say </w:t>
       </w:r>
+      <w:proofErr w:type="gramStart"/>
       <w:r>
         <w:t>m</w:t>
       </w:r>
       <w:r>
-        <w:t>ore or less the same thing.</w:t>
+        <w:t>ore or less the</w:t>
+      </w:r>
+      <w:proofErr w:type="gramEnd"/>
+      <w:r>
+        <w:t xml:space="preserve"> same thing.</w:t>
       </w:r>
       <w:r>
         <w:rPr>
@@ -257,8 +270,13 @@
     </w:p>
     <w:p/>
     <w:p>
-      <w:r>
-        <w:t xml:space="preserve">Actually, it’s </w:t>
+      <w:proofErr w:type="gramStart"/>
+      <w:r>
+        <w:t>Actually, it’s</w:t>
+      </w:r>
+      <w:proofErr w:type="gramEnd"/>
+      <w:r>
+        <w:t xml:space="preserve"> </w:t>
       </w:r>
       <w:r>
         <w:t>difficult to see</w:t>
@@ -702,7 +720,15 @@
     <w:p/>
     <w:p>
       <w:r>
-        <w:t xml:space="preserve">What if you have the conversation about the splitters here, rather than in </w:t>
+        <w:t xml:space="preserve">What if you have </w:t>
+      </w:r>
+      <w:proofErr w:type="gramStart"/>
+      <w:r>
+        <w:t>the</w:t>
+      </w:r>
+      <w:proofErr w:type="gramEnd"/>
+      <w:r>
+        <w:t xml:space="preserve"> conversation about the splitters here, rather than in </w:t>
       </w:r>
       <w:proofErr w:type="spellStart"/>
       <w:r>
@@ -716,7 +742,15 @@
         <w:t>W</w:t>
       </w:r>
       <w:r>
-        <w:t>hy have it in two places?</w:t>
+        <w:t xml:space="preserve">hy </w:t>
+      </w:r>
+      <w:proofErr w:type="gramStart"/>
+      <w:r>
+        <w:t>have</w:t>
+      </w:r>
+      <w:proofErr w:type="gramEnd"/>
+      <w:r>
+        <w:t xml:space="preserve"> it in two places?</w:t>
       </w:r>
       <w:r>
         <w:br/>
@@ -903,7 +937,15 @@
       </w:r>
       <w:proofErr w:type="spellEnd"/>
       <w:r>
-        <w:t xml:space="preserve"> (should compare be capitalized here? Or should Flow be lower case in the other model name?) and you can discuss the two configurations before running the parametric sweep.</w:t>
+        <w:t xml:space="preserve"> (should compare be capitalized here? Or should Flow be lower case in the other </w:t>
+      </w:r>
+      <w:proofErr w:type="gramStart"/>
+      <w:r>
+        <w:t>model</w:t>
+      </w:r>
+      <w:proofErr w:type="gramEnd"/>
+      <w:r>
+        <w:t xml:space="preserve"> name?) and you can discuss the two configurations before running the parametric sweep.</w:t>
       </w:r>
     </w:p>
     <w:p/>
@@ -1067,7 +1109,15 @@
     <w:p/>
     <w:p>
       <w:r>
-        <w:t>Can you put this paragraph directly under the picture of the model? Then, maybe also have a picture of the mask. You have a lot of references to parameters in the mask, and it would be helpful to see them as you refer to them.</w:t>
+        <w:t xml:space="preserve">Can you put this paragraph directly under the picture of the model? Then, </w:t>
+      </w:r>
+      <w:proofErr w:type="gramStart"/>
+      <w:r>
+        <w:t>maybe</w:t>
+      </w:r>
+      <w:proofErr w:type="gramEnd"/>
+      <w:r>
+        <w:t xml:space="preserve"> also have a picture of the mask. You have a lot of references to parameters in the mask, and it would be helpful to see them as you refer to them.</w:t>
       </w:r>
       <w:r>
         <w:rPr>
@@ -1113,7 +1163,15 @@
     <w:p/>
     <w:p>
       <w:r>
-        <w:t xml:space="preserve">The discussion about the operating point belongs with the figure above the pump efficiency figure. You should also discuss the efficiency curve, otherwise, why are you plotting it? And, </w:t>
+        <w:t xml:space="preserve">The discussion about the operating point belongs with the figure above the pump efficiency figure. You should also discuss the efficiency curve, otherwise, why are you plotting it? </w:t>
+      </w:r>
+      <w:proofErr w:type="gramStart"/>
+      <w:r>
+        <w:t>And,</w:t>
+      </w:r>
+      <w:proofErr w:type="gramEnd"/>
+      <w:r>
+        <w:t xml:space="preserve"> </w:t>
       </w:r>
       <w:r>
         <w:lastRenderedPageBreak/>
@@ -1227,7 +1285,15 @@
     </w:p>
     <w:p>
       <w:r>
-        <w:t>Maybe a picture of the mask would be helpful here. The parameter is “Flow Geometry”, the parameter value is “Flow inside one or more tubes”. Should the formatting be different to reflect that? Or, should the parameter name be called out explicitly?</w:t>
+        <w:t xml:space="preserve">Maybe a picture of the mask would be helpful here. The parameter is “Flow Geometry”, the parameter value is “Flow inside one or more tubes”. Should the formatting be different to reflect that? </w:t>
+      </w:r>
+      <w:proofErr w:type="gramStart"/>
+      <w:r>
+        <w:t>Or,</w:t>
+      </w:r>
+      <w:proofErr w:type="gramEnd"/>
+      <w:r>
+        <w:t xml:space="preserve"> should the parameter name be called out explicitly?</w:t>
       </w:r>
       <w:r>
         <w:rPr>
@@ -1273,7 +1339,15 @@
     <w:p/>
     <w:p>
       <w:r>
-        <w:t xml:space="preserve">Reading further, I think it’s doubly important to show the mask and the parameters you care about because now it’s getting confusing just looking at words. Maybe put both of these </w:t>
+        <w:t xml:space="preserve">Reading further, I think it’s doubly important to show the mask and the parameters you care about because now it’s getting confusing just looking at words. Maybe put </w:t>
+      </w:r>
+      <w:proofErr w:type="gramStart"/>
+      <w:r>
+        <w:t>both of these</w:t>
+      </w:r>
+      <w:proofErr w:type="gramEnd"/>
+      <w:r>
+        <w:t xml:space="preserve"> </w:t>
       </w:r>
       <w:r>
         <w:lastRenderedPageBreak/>
@@ -2635,4 +2709,10 @@
     </a:ext>
   </a:extLst>
 </a:theme>
+</file>
+
+<file path=docMetadata/LabelInfo.xml><?xml version="1.0" encoding="utf-8"?>
+<clbl:labelList xmlns:clbl="http://schemas.microsoft.com/office/2020/mipLabelMetadata">
+  <clbl:label id="{99dd3a11-4348-4468-9bdd-e5072b1dc1e6}" enabled="0" method="" siteId="{99dd3a11-4348-4468-9bdd-e5072b1dc1e6}" removed="1"/>
+</clbl:labelList>
 </file>
</xml_diff>